<commit_message>
Rewrite conclusion with deeper, non-obvious insights
Replace the tautological "more/better features = better balancing"
takeaway with four concrete findings grounded in the actual numbers:
balancing as operating-point calibration (not quality improvement),
undersampling's data-loss failure mode under extreme imbalance,
the feature-quality ceiling, and the ROC-AUC vs PR-AUC trap.
</commit_message>
<xml_diff>
--- a/fraud-detection-balancing/article.docx
+++ b/fraud-detection-balancing/article.docx
@@ -6022,7 +6022,61 @@
           <w:sz w:val="24"/>
           <w:szCs w:val="24"/>
         </w:rPr>
-        <w:t xml:space="preserve">Проведённое исследование показало, что эффективность методов балансировки определяется в первую очередь качеством признакового пространства, а не только степенью дисбаланса [8], SMOTE является наиболее безопасным методом: на информативных данных он даёт умеренный прирост Recall без существенных потерь Precision. Random Undersampling при высоком дисбалансе (&lt;1 %) приводит к потере критического объёма данных и не рекомендуется без дополнительных мер. Ансамблевые модели (Random Forest, XGBoost) показали наилучшие результаты на обоих датасетах.</w:t>
+        <w:t xml:space="preserve">Проведённое исследование показывает, что методы балансировки классов (SMOTE, Random Undersampling) не повышают саму способность модели различать легитимные и мошеннические операции — они лишь смещают рабочую точку модели, то есть соотношение между Recall (долей найденных мошенничеств от их общего числа) и Precision (долей верных срабатываний среди всех поданных сигналов тревоги). Это видно на датасете Bank Account Fraud: у логистической регрессии SMOTE поднимает Recall с 0,010 до 0,744, однако ROC-AUC при этом почти не меняется (0,869 → 0,867) — модель как плохо отделяла классы, так и продолжает это делать, просто чаще сигнализирует о подозрении.</w:t>
+      </w:r>
+    </w:p>
+    <w:p>
+      <w:pPr>
+        <w:spacing w:line="360" w:lineRule="auto"/>
+        <w:ind w:firstLine="709"/>
+        <w:jc w:val="both"/>
+        <w:rPr>
+          <w:sz w:val="24"/>
+          <w:szCs w:val="24"/>
+        </w:rPr>
+      </w:pPr>
+      <w:r>
+        <w:rPr>
+          <w:sz w:val="24"/>
+          <w:szCs w:val="24"/>
+        </w:rPr>
+        <w:t xml:space="preserve">Random Undersampling при экстремальном дисбалансе (&lt;1 %) опасен даже на данных с хорошо разделимыми классами: на Credit Card Fraud, где Random Forest без какой-либо балансировки достигает F1 = 0,859, тот же Random Undersampling обрушивает F1 до 0,114. Причина не в качестве признаков, а в том, что при таком дисбалансе метод отбрасывает почти весь обучающий набор, оставляя слишком мало данных для обучения.</w:t>
+      </w:r>
+    </w:p>
+    <w:p>
+      <w:pPr>
+        <w:spacing w:line="360" w:lineRule="auto"/>
+        <w:ind w:firstLine="709"/>
+        <w:jc w:val="both"/>
+        <w:rPr>
+          <w:sz w:val="24"/>
+          <w:szCs w:val="24"/>
+        </w:rPr>
+      </w:pPr>
+      <w:r>
+        <w:rPr>
+          <w:sz w:val="24"/>
+          <w:szCs w:val="24"/>
+        </w:rPr>
+        <w:t xml:space="preserve">Качество признакового пространства задаёт жёсткий потолок, который балансировка преодолеть не может: на Bank Account Fraud, где признаки слабо коррелируют с фактом мошенничества, Random Forest без балансировки не находит ни одной мошеннической операции (F1 = 0), а после применения любого метода балансировки F1 не поднимается выше 0,08 независимо от алгоритма.</w:t>
+      </w:r>
+    </w:p>
+    <w:p>
+      <w:pPr>
+        <w:spacing w:line="360" w:lineRule="auto"/>
+        <w:ind w:firstLine="709"/>
+        <w:jc w:val="both"/>
+        <w:rPr>
+          <w:sz w:val="24"/>
+          <w:szCs w:val="24"/>
+        </w:rPr>
+      </w:pPr>
+      <w:r>
+        <w:rPr>
+          <w:sz w:val="24"/>
+          <w:szCs w:val="24"/>
+        </w:rPr>
+        <w:t xml:space="preserve">Отдельный практический вывод касается выбора метрики: при сильном дисбалансе классов ROC-AUC создаёт ложное ощущение качества модели (0,80–0,87 на Bank Account Fraud), тогда как PR-AUC (0,08–0,12) показывает, что реальная способность находить мошенничество остаётся крайне низкой — при мониторинге таких моделей в продакшене ориентироваться только на ROC-AUC нельзя. При этом ансамблевые модели (Random Forest, XGBoost) показали наилучшие результаты на обоих датасетах и оказались устойчивее линейной модели к выбору стратегии балансировки.</w:t>
       </w:r>
     </w:p>
     <w:p>

</xml_diff>